<commit_message>
27/12/2025 - 18:14 h
</commit_message>
<xml_diff>
--- a/O mandamento maior/O Mandamento Maior - Com destaques no texto.docx
+++ b/O mandamento maior/O Mandamento Maior - Com destaques no texto.docx
@@ -8839,7 +8839,9 @@
         </w:rPr>
       </w:pPr>
       <w:r>
-        <w:rPr/>
+        <w:rPr>
+          <w:u w:val="none"/>
+        </w:rPr>
       </w:r>
       <w:r>
         <w:br w:type="page"/>
@@ -8916,33 +8918,7 @@
           <w:shd w:fill="auto" w:val="clear"/>
           <w:lang w:val="en-US" w:eastAsia="zh-CN" w:bidi="hi-IN"/>
         </w:rPr>
-        <w:t xml:space="preserve">, Latour se deparava com uma </w:t>
-      </w:r>
-      <w:r>
-        <w:rPr>
-          <w:rFonts w:eastAsia="Times New Roman" w:cs="Times New Roman" w:ascii="Garamond" w:hAnsi="Garamond"/>
-          <w:color w:val="000000"/>
-          <w:kern w:val="0"/>
-          <w:sz w:val="36"/>
-          <w:szCs w:val="36"/>
-          <w:u w:val="none"/>
-          <w:shd w:fill="auto" w:val="clear"/>
-          <w:lang w:val="en-US" w:eastAsia="zh-CN" w:bidi="hi-IN"/>
-        </w:rPr>
-        <w:t>dura realidade</w:t>
-      </w:r>
-      <w:r>
-        <w:rPr>
-          <w:rFonts w:eastAsia="Times New Roman" w:cs="Times New Roman" w:ascii="Garamond" w:hAnsi="Garamond"/>
-          <w:color w:val="000000"/>
-          <w:kern w:val="0"/>
-          <w:sz w:val="36"/>
-          <w:szCs w:val="36"/>
-          <w:u w:val="none"/>
-          <w:shd w:fill="auto" w:val="clear"/>
-          <w:lang w:val="en-US" w:eastAsia="zh-CN" w:bidi="hi-IN"/>
-        </w:rPr>
-        <w:t xml:space="preserve">: </w:t>
+        <w:t xml:space="preserve">, Latour se deparava com uma dura realidade: </w:t>
       </w:r>
       <w:r>
         <w:rPr>
@@ -9120,42 +9096,31 @@
         </w:rPr>
       </w:pPr>
       <w:r>
-        <w:rPr/>
-      </w:r>
-    </w:p>
-    <w:p>
-      <w:pPr>
-        <w:pStyle w:val="Normal"/>
-        <w:jc w:val="both"/>
-        <w:rPr>
-          <w:u w:val="none"/>
-        </w:rPr>
-      </w:pPr>
-      <w:r>
-        <w:rPr>
-          <w:rFonts w:eastAsia="Times New Roman" w:cs="Times New Roman" w:ascii="Garamond" w:hAnsi="Garamond"/>
-          <w:color w:val="000000"/>
-          <w:kern w:val="0"/>
-          <w:sz w:val="36"/>
-          <w:szCs w:val="36"/>
-          <w:u w:val="none"/>
-          <w:shd w:fill="auto" w:val="clear"/>
-          <w:lang w:val="en-US" w:eastAsia="zh-CN" w:bidi="hi-IN"/>
-        </w:rPr>
-        <w:t>R</w:t>
-      </w:r>
-      <w:r>
-        <w:rPr>
-          <w:rFonts w:eastAsia="Times New Roman" w:cs="Times New Roman" w:ascii="Garamond" w:hAnsi="Garamond"/>
-          <w:color w:val="000000"/>
-          <w:kern w:val="0"/>
-          <w:sz w:val="36"/>
-          <w:szCs w:val="36"/>
-          <w:u w:val="none"/>
-          <w:shd w:fill="auto" w:val="clear"/>
-          <w:lang w:val="en-US" w:eastAsia="zh-CN" w:bidi="hi-IN"/>
-        </w:rPr>
-        <w:t xml:space="preserve">econhece que sofre por </w:t>
+        <w:rPr>
+          <w:u w:val="none"/>
+        </w:rPr>
+      </w:r>
+    </w:p>
+    <w:p>
+      <w:pPr>
+        <w:pStyle w:val="Normal"/>
+        <w:jc w:val="both"/>
+        <w:rPr>
+          <w:u w:val="none"/>
+        </w:rPr>
+      </w:pPr>
+      <w:r>
+        <w:rPr>
+          <w:rFonts w:eastAsia="Times New Roman" w:cs="Times New Roman" w:ascii="Garamond" w:hAnsi="Garamond"/>
+          <w:color w:val="000000"/>
+          <w:kern w:val="0"/>
+          <w:sz w:val="36"/>
+          <w:szCs w:val="36"/>
+          <w:u w:val="none"/>
+          <w:shd w:fill="auto" w:val="clear"/>
+          <w:lang w:val="en-US" w:eastAsia="zh-CN" w:bidi="hi-IN"/>
+        </w:rPr>
+        <w:t xml:space="preserve">Reconhece que sofre por </w:t>
       </w:r>
       <w:r>
         <w:rPr>
@@ -9477,7 +9442,9 @@
         </w:rPr>
       </w:pPr>
       <w:r>
-        <w:rPr/>
+        <w:rPr>
+          <w:u w:val="none"/>
+        </w:rPr>
       </w:r>
       <w:r>
         <w:br w:type="page"/>
@@ -9590,33 +9557,7 @@
           <w:shd w:fill="auto" w:val="clear"/>
           <w:lang w:val="en-US" w:eastAsia="zh-CN" w:bidi="hi-IN"/>
         </w:rPr>
-        <w:t xml:space="preserve"> em outra existência, para reparar o mal cometido. </w:t>
-      </w:r>
-      <w:r>
-        <w:rPr>
-          <w:rFonts w:eastAsia="Times New Roman" w:cs="Times New Roman" w:ascii="Garamond" w:hAnsi="Garamond"/>
-          <w:color w:val="000000"/>
-          <w:kern w:val="0"/>
-          <w:sz w:val="36"/>
-          <w:szCs w:val="36"/>
-          <w:u w:val="none"/>
-          <w:shd w:fill="auto" w:val="clear"/>
-          <w:lang w:val="en-US" w:eastAsia="zh-CN" w:bidi="hi-IN"/>
-        </w:rPr>
-        <w:t>A</w:t>
-      </w:r>
-      <w:r>
-        <w:rPr>
-          <w:rFonts w:eastAsia="Times New Roman" w:cs="Times New Roman" w:ascii="Garamond" w:hAnsi="Garamond"/>
-          <w:color w:val="000000"/>
-          <w:kern w:val="0"/>
-          <w:sz w:val="36"/>
-          <w:szCs w:val="36"/>
-          <w:u w:val="none"/>
-          <w:shd w:fill="auto" w:val="clear"/>
-          <w:lang w:val="en-US" w:eastAsia="zh-CN" w:bidi="hi-IN"/>
-        </w:rPr>
-        <w:t xml:space="preserve"> </w:t>
+        <w:t xml:space="preserve"> em outra existência, para reparar o mal cometido. A </w:t>
       </w:r>
       <w:r>
         <w:rPr>
@@ -9680,7 +9621,9 @@
         </w:rPr>
       </w:pPr>
       <w:r>
-        <w:rPr/>
+        <w:rPr>
+          <w:u w:val="none"/>
+        </w:rPr>
       </w:r>
     </w:p>
     <w:p>
@@ -10108,7 +10051,9 @@
         </w:rPr>
       </w:pPr>
       <w:r>
-        <w:rPr/>
+        <w:rPr>
+          <w:u w:val="none"/>
+        </w:rPr>
       </w:r>
     </w:p>
     <w:p>
@@ -11102,7 +11047,10 @@
         </w:rPr>
       </w:pPr>
       <w:r>
-        <w:rPr/>
+        <w:rPr>
+          <w:sz w:val="36"/>
+          <w:szCs w:val="36"/>
+        </w:rPr>
       </w:r>
     </w:p>
     <w:p>
@@ -11201,7 +11149,10 @@
         </w:rPr>
       </w:pPr>
       <w:r>
-        <w:rPr/>
+        <w:rPr>
+          <w:sz w:val="36"/>
+          <w:szCs w:val="36"/>
+        </w:rPr>
       </w:r>
       <w:r>
         <w:br w:type="page"/>
@@ -11563,7 +11514,15 @@
         </w:rPr>
       </w:pPr>
       <w:r>
-        <w:rPr/>
+        <w:rPr>
+          <w:rFonts w:eastAsia="Times New Roman" w:cs="Times New Roman" w:ascii="Garamond" w:hAnsi="Garamond"/>
+          <w:color w:val="000000"/>
+          <w:kern w:val="0"/>
+          <w:sz w:val="36"/>
+          <w:szCs w:val="36"/>
+          <w:shd w:fill="auto" w:val="clear"/>
+          <w:lang w:val="en-US" w:eastAsia="zh-CN" w:bidi="hi-IN"/>
+        </w:rPr>
       </w:r>
     </w:p>
     <w:p>
@@ -11658,7 +11617,15 @@
         </w:rPr>
       </w:pPr>
       <w:r>
-        <w:rPr/>
+        <w:rPr>
+          <w:rFonts w:eastAsia="Times New Roman" w:cs="Times New Roman" w:ascii="Garamond" w:hAnsi="Garamond"/>
+          <w:color w:val="000000"/>
+          <w:kern w:val="0"/>
+          <w:sz w:val="36"/>
+          <w:szCs w:val="36"/>
+          <w:shd w:fill="auto" w:val="clear"/>
+          <w:lang w:val="en-US" w:eastAsia="zh-CN" w:bidi="hi-IN"/>
+        </w:rPr>
       </w:r>
       <w:r>
         <w:br w:type="page"/>
@@ -12182,7 +12149,15 @@
         </w:rPr>
       </w:pPr>
       <w:r>
-        <w:rPr/>
+        <w:rPr>
+          <w:rFonts w:eastAsia="Times New Roman" w:cs="Times New Roman" w:ascii="Garamond" w:hAnsi="Garamond"/>
+          <w:color w:val="000000"/>
+          <w:kern w:val="0"/>
+          <w:sz w:val="36"/>
+          <w:szCs w:val="36"/>
+          <w:shd w:fill="auto" w:val="clear"/>
+          <w:lang w:val="en-US" w:eastAsia="zh-CN" w:bidi="hi-IN"/>
+        </w:rPr>
       </w:r>
     </w:p>
     <w:p>
@@ -12560,31 +12535,7 @@
           <w:shd w:fill="auto" w:val="clear"/>
           <w:lang w:val="en-US" w:eastAsia="zh-CN" w:bidi="hi-IN"/>
         </w:rPr>
-        <w:t>.</w:t>
-      </w:r>
-      <w:r>
-        <w:rPr>
-          <w:rFonts w:eastAsia="Times New Roman" w:cs="Times New Roman" w:ascii="Garamond" w:hAnsi="Garamond"/>
-          <w:color w:val="000000"/>
-          <w:kern w:val="0"/>
-          <w:sz w:val="36"/>
-          <w:szCs w:val="36"/>
-          <w:shd w:fill="auto" w:val="clear"/>
-          <w:lang w:val="en-US" w:eastAsia="zh-CN" w:bidi="hi-IN"/>
-        </w:rPr>
-        <w:t xml:space="preserve"> </w:t>
-      </w:r>
-      <w:r>
-        <w:rPr>
-          <w:rFonts w:eastAsia="Times New Roman" w:cs="Times New Roman" w:ascii="Garamond" w:hAnsi="Garamond"/>
-          <w:color w:val="000000"/>
-          <w:kern w:val="0"/>
-          <w:sz w:val="36"/>
-          <w:szCs w:val="36"/>
-          <w:shd w:fill="auto" w:val="clear"/>
-          <w:lang w:val="en-US" w:eastAsia="zh-CN" w:bidi="hi-IN"/>
-        </w:rPr>
-        <w:t xml:space="preserve">Na </w:t>
+        <w:t xml:space="preserve">. Na </w:t>
       </w:r>
       <w:r>
         <w:rPr>
@@ -12626,7 +12577,15 @@
         </w:rPr>
       </w:pPr>
       <w:r>
-        <w:rPr/>
+        <w:rPr>
+          <w:rFonts w:eastAsia="Times New Roman" w:cs="Times New Roman" w:ascii="Garamond" w:hAnsi="Garamond"/>
+          <w:color w:val="000000"/>
+          <w:kern w:val="0"/>
+          <w:sz w:val="36"/>
+          <w:szCs w:val="36"/>
+          <w:shd w:fill="auto" w:val="clear"/>
+          <w:lang w:val="en-US" w:eastAsia="zh-CN" w:bidi="hi-IN"/>
+        </w:rPr>
       </w:r>
     </w:p>
     <w:p>
@@ -12677,19 +12636,7 @@
           <w:shd w:fill="auto" w:val="clear"/>
           <w:lang w:val="en-US" w:eastAsia="zh-CN" w:bidi="hi-IN"/>
         </w:rPr>
-        <w:t xml:space="preserve">. Isso é </w:t>
-      </w:r>
-      <w:r>
-        <w:rPr>
-          <w:rFonts w:eastAsia="Times New Roman" w:cs="Times New Roman" w:ascii="Garamond" w:hAnsi="Garamond"/>
-          <w:color w:val="000000"/>
-          <w:kern w:val="0"/>
-          <w:sz w:val="36"/>
-          <w:szCs w:val="36"/>
-          <w:shd w:fill="auto" w:val="clear"/>
-          <w:lang w:val="en-US" w:eastAsia="zh-CN" w:bidi="hi-IN"/>
-        </w:rPr>
-        <w:t xml:space="preserve">uma espécie de </w:t>
+        <w:t xml:space="preserve">. Isso é uma espécie de </w:t>
       </w:r>
       <w:r>
         <w:rPr>
@@ -12713,67 +12660,120 @@
           <w:shd w:fill="auto" w:val="clear"/>
           <w:lang w:val="en-US" w:eastAsia="zh-CN" w:bidi="hi-IN"/>
         </w:rPr>
+        <w:t xml:space="preserve">. Esses sentimentos nos </w:t>
+      </w:r>
+      <w:r>
+        <w:rPr>
+          <w:rFonts w:eastAsia="Times New Roman" w:cs="Times New Roman" w:ascii="Garamond" w:hAnsi="Garamond"/>
+          <w:color w:val="000000"/>
+          <w:kern w:val="0"/>
+          <w:sz w:val="36"/>
+          <w:szCs w:val="36"/>
+          <w:shd w:fill="FFFF00" w:val="clear"/>
+          <w:lang w:val="en-US" w:eastAsia="zh-CN" w:bidi="hi-IN"/>
+        </w:rPr>
+        <w:t>prendem ao passado e nos adoecem</w:t>
+      </w:r>
+      <w:r>
+        <w:rPr>
+          <w:rFonts w:eastAsia="Times New Roman" w:cs="Times New Roman" w:ascii="Garamond" w:hAnsi="Garamond"/>
+          <w:color w:val="000000"/>
+          <w:kern w:val="0"/>
+          <w:sz w:val="36"/>
+          <w:szCs w:val="36"/>
+          <w:shd w:fill="auto" w:val="clear"/>
+          <w:lang w:val="en-US" w:eastAsia="zh-CN" w:bidi="hi-IN"/>
+        </w:rPr>
         <w:t xml:space="preserve">. </w:t>
       </w:r>
-      <w:r>
-        <w:rPr>
-          <w:rFonts w:eastAsia="Times New Roman" w:cs="Times New Roman" w:ascii="Garamond" w:hAnsi="Garamond"/>
-          <w:color w:val="000000"/>
-          <w:kern w:val="0"/>
-          <w:sz w:val="36"/>
-          <w:szCs w:val="36"/>
-          <w:shd w:fill="auto" w:val="clear"/>
-          <w:lang w:val="en-US" w:eastAsia="zh-CN" w:bidi="hi-IN"/>
-        </w:rPr>
-        <w:t>Esses sentimentos</w:t>
-      </w:r>
-      <w:r>
-        <w:rPr>
-          <w:rFonts w:eastAsia="Times New Roman" w:cs="Times New Roman" w:ascii="Garamond" w:hAnsi="Garamond"/>
-          <w:color w:val="000000"/>
-          <w:kern w:val="0"/>
-          <w:sz w:val="36"/>
-          <w:szCs w:val="36"/>
-          <w:shd w:fill="auto" w:val="clear"/>
-          <w:lang w:val="en-US" w:eastAsia="zh-CN" w:bidi="hi-IN"/>
-        </w:rPr>
-        <w:t xml:space="preserve"> nos </w:t>
-      </w:r>
-      <w:r>
-        <w:rPr>
-          <w:rFonts w:eastAsia="Times New Roman" w:cs="Times New Roman" w:ascii="Garamond" w:hAnsi="Garamond"/>
-          <w:color w:val="000000"/>
-          <w:kern w:val="0"/>
-          <w:sz w:val="36"/>
-          <w:szCs w:val="36"/>
-          <w:shd w:fill="FFFF00" w:val="clear"/>
-          <w:lang w:val="en-US" w:eastAsia="zh-CN" w:bidi="hi-IN"/>
-        </w:rPr>
-        <w:t>prendem ao passado</w:t>
-      </w:r>
-      <w:r>
-        <w:rPr>
-          <w:rFonts w:eastAsia="Times New Roman" w:cs="Times New Roman" w:ascii="Garamond" w:hAnsi="Garamond"/>
-          <w:color w:val="000000"/>
-          <w:kern w:val="0"/>
-          <w:sz w:val="36"/>
-          <w:szCs w:val="36"/>
-          <w:shd w:fill="FFFF00" w:val="clear"/>
-          <w:lang w:val="en-US" w:eastAsia="zh-CN" w:bidi="hi-IN"/>
-        </w:rPr>
-        <w:t xml:space="preserve"> e</w:t>
-      </w:r>
-      <w:r>
-        <w:rPr>
-          <w:rFonts w:eastAsia="Times New Roman" w:cs="Times New Roman" w:ascii="Garamond" w:hAnsi="Garamond"/>
-          <w:color w:val="000000"/>
-          <w:kern w:val="0"/>
-          <w:sz w:val="36"/>
-          <w:szCs w:val="36"/>
-          <w:shd w:fill="FFFF00" w:val="clear"/>
-          <w:lang w:val="en-US" w:eastAsia="zh-CN" w:bidi="hi-IN"/>
-        </w:rPr>
-        <w:t xml:space="preserve"> nos adoecem</w:t>
+    </w:p>
+    <w:p>
+      <w:pPr>
+        <w:pStyle w:val="Normal"/>
+        <w:jc w:val="both"/>
+        <w:rPr>
+          <w:rFonts w:ascii="Garamond" w:hAnsi="Garamond" w:eastAsia="Times New Roman" w:cs="Times New Roman"/>
+          <w:color w:val="auto"/>
+          <w:kern w:val="0"/>
+          <w:sz w:val="36"/>
+          <w:szCs w:val="36"/>
+          <w:shd w:fill="auto" w:val="clear"/>
+          <w:lang w:val="en-US" w:eastAsia="zh-CN" w:bidi="hi-IN"/>
+        </w:rPr>
+      </w:pPr>
+      <w:r>
+        <w:rPr>
+          <w:rFonts w:eastAsia="Times New Roman" w:cs="Times New Roman" w:ascii="Garamond" w:hAnsi="Garamond"/>
+          <w:color w:val="000000"/>
+          <w:kern w:val="0"/>
+          <w:sz w:val="36"/>
+          <w:szCs w:val="36"/>
+          <w:shd w:fill="auto" w:val="clear"/>
+          <w:lang w:val="en-US" w:eastAsia="zh-CN" w:bidi="hi-IN"/>
+        </w:rPr>
+      </w:r>
+    </w:p>
+    <w:p>
+      <w:pPr>
+        <w:pStyle w:val="Normal"/>
+        <w:jc w:val="both"/>
+        <w:rPr>
+          <w:rFonts w:ascii="Garamond" w:hAnsi="Garamond" w:eastAsia="Times New Roman" w:cs="Times New Roman"/>
+          <w:color w:val="auto"/>
+          <w:kern w:val="0"/>
+          <w:sz w:val="36"/>
+          <w:szCs w:val="36"/>
+          <w:shd w:fill="auto" w:val="clear"/>
+          <w:lang w:val="en-US" w:eastAsia="zh-CN" w:bidi="hi-IN"/>
+        </w:rPr>
+      </w:pPr>
+      <w:r>
+        <w:rPr>
+          <w:rFonts w:eastAsia="Times New Roman" w:cs="Times New Roman" w:ascii="Garamond" w:hAnsi="Garamond"/>
+          <w:color w:val="000000"/>
+          <w:kern w:val="0"/>
+          <w:sz w:val="36"/>
+          <w:szCs w:val="36"/>
+          <w:shd w:fill="auto" w:val="clear"/>
+          <w:lang w:val="en-US" w:eastAsia="zh-CN" w:bidi="hi-IN"/>
+        </w:rPr>
+        <w:t xml:space="preserve">Também </w:t>
+      </w:r>
+      <w:r>
+        <w:rPr>
+          <w:rFonts w:eastAsia="Times New Roman" w:cs="Times New Roman" w:ascii="Garamond" w:hAnsi="Garamond"/>
+          <w:color w:val="000000"/>
+          <w:kern w:val="0"/>
+          <w:sz w:val="36"/>
+          <w:szCs w:val="36"/>
+          <w:shd w:fill="FFFF00" w:val="clear"/>
+          <w:lang w:val="en-US" w:eastAsia="zh-CN" w:bidi="hi-IN"/>
+        </w:rPr>
+        <w:t>revelamos falta de amor próprio</w:t>
+      </w:r>
+      <w:r>
+        <w:rPr>
+          <w:rFonts w:eastAsia="Times New Roman" w:cs="Times New Roman" w:ascii="Garamond" w:hAnsi="Garamond"/>
+          <w:color w:val="000000"/>
+          <w:kern w:val="0"/>
+          <w:sz w:val="36"/>
+          <w:szCs w:val="36"/>
+          <w:shd w:fill="auto" w:val="clear"/>
+          <w:lang w:val="en-US" w:eastAsia="zh-CN" w:bidi="hi-IN"/>
+        </w:rPr>
+        <w:t xml:space="preserve"> quando insistimos em </w:t>
+      </w:r>
+      <w:r>
+        <w:rPr>
+          <w:rFonts w:eastAsia="Times New Roman" w:cs="Times New Roman" w:ascii="Garamond" w:hAnsi="Garamond"/>
+          <w:color w:val="000000"/>
+          <w:kern w:val="0"/>
+          <w:sz w:val="36"/>
+          <w:szCs w:val="36"/>
+          <w:shd w:fill="FFFF00" w:val="clear"/>
+          <w:lang w:val="en-US" w:eastAsia="zh-CN" w:bidi="hi-IN"/>
+        </w:rPr>
+        <w:t>repetir comportamentos que nos prejudicam, mantendo vícios e hábitos nocivos que agridem o corpo e a alma</w:t>
       </w:r>
       <w:r>
         <w:rPr>
@@ -12803,7 +12803,15 @@
         </w:rPr>
       </w:pPr>
       <w:r>
-        <w:rPr/>
+        <w:rPr>
+          <w:rFonts w:eastAsia="Times New Roman" w:cs="Times New Roman" w:ascii="Garamond" w:hAnsi="Garamond"/>
+          <w:color w:val="000000"/>
+          <w:kern w:val="0"/>
+          <w:sz w:val="36"/>
+          <w:szCs w:val="36"/>
+          <w:shd w:fill="auto" w:val="clear"/>
+          <w:lang w:val="en-US" w:eastAsia="zh-CN" w:bidi="hi-IN"/>
+        </w:rPr>
       </w:r>
     </w:p>
     <w:p>
@@ -12830,55 +12838,103 @@
           <w:shd w:fill="auto" w:val="clear"/>
           <w:lang w:val="en-US" w:eastAsia="zh-CN" w:bidi="hi-IN"/>
         </w:rPr>
-        <w:t xml:space="preserve">Também </w:t>
-      </w:r>
-      <w:r>
-        <w:rPr>
-          <w:rFonts w:eastAsia="Times New Roman" w:cs="Times New Roman" w:ascii="Garamond" w:hAnsi="Garamond"/>
-          <w:color w:val="000000"/>
-          <w:kern w:val="0"/>
-          <w:sz w:val="36"/>
-          <w:szCs w:val="36"/>
-          <w:shd w:fill="FFFF00" w:val="clear"/>
-          <w:lang w:val="en-US" w:eastAsia="zh-CN" w:bidi="hi-IN"/>
-        </w:rPr>
-        <w:t>revelamos falta de amor próprio</w:t>
-      </w:r>
-      <w:r>
-        <w:rPr>
-          <w:rFonts w:eastAsia="Times New Roman" w:cs="Times New Roman" w:ascii="Garamond" w:hAnsi="Garamond"/>
-          <w:color w:val="000000"/>
-          <w:kern w:val="0"/>
-          <w:sz w:val="36"/>
-          <w:szCs w:val="36"/>
-          <w:shd w:fill="auto" w:val="clear"/>
-          <w:lang w:val="en-US" w:eastAsia="zh-CN" w:bidi="hi-IN"/>
-        </w:rPr>
-        <w:t xml:space="preserve"> quando insistimos em </w:t>
-      </w:r>
-      <w:r>
-        <w:rPr>
-          <w:rFonts w:eastAsia="Times New Roman" w:cs="Times New Roman" w:ascii="Garamond" w:hAnsi="Garamond"/>
-          <w:color w:val="000000"/>
-          <w:kern w:val="0"/>
-          <w:sz w:val="36"/>
-          <w:szCs w:val="36"/>
-          <w:shd w:fill="FFFF00" w:val="clear"/>
-          <w:lang w:val="en-US" w:eastAsia="zh-CN" w:bidi="hi-IN"/>
-        </w:rPr>
-        <w:t>repetir comportamentos que nos prejudicam, mantendo vícios e hábitos nocivos que agridem o corpo e a alma</w:t>
-      </w:r>
-      <w:r>
-        <w:rPr>
-          <w:rFonts w:eastAsia="Times New Roman" w:cs="Times New Roman" w:ascii="Garamond" w:hAnsi="Garamond"/>
-          <w:color w:val="000000"/>
-          <w:kern w:val="0"/>
-          <w:sz w:val="36"/>
-          <w:szCs w:val="36"/>
-          <w:shd w:fill="auto" w:val="clear"/>
-          <w:lang w:val="en-US" w:eastAsia="zh-CN" w:bidi="hi-IN"/>
-        </w:rPr>
-        <w:t xml:space="preserve">. </w:t>
+        <w:t xml:space="preserve">Amar a si mesmo é </w:t>
+      </w:r>
+      <w:r>
+        <w:rPr>
+          <w:rFonts w:eastAsia="Times New Roman" w:cs="Times New Roman" w:ascii="Garamond" w:hAnsi="Garamond"/>
+          <w:color w:val="000000"/>
+          <w:kern w:val="0"/>
+          <w:sz w:val="36"/>
+          <w:szCs w:val="36"/>
+          <w:shd w:fill="FFFF00" w:val="clear"/>
+          <w:lang w:val="en-US" w:eastAsia="zh-CN" w:bidi="hi-IN"/>
+        </w:rPr>
+        <w:t>reconhecer-se como espírito imortal</w:t>
+      </w:r>
+      <w:r>
+        <w:rPr>
+          <w:rFonts w:eastAsia="Times New Roman" w:cs="Times New Roman" w:ascii="Garamond" w:hAnsi="Garamond"/>
+          <w:color w:val="000000"/>
+          <w:kern w:val="0"/>
+          <w:sz w:val="36"/>
+          <w:szCs w:val="36"/>
+          <w:shd w:fill="auto" w:val="clear"/>
+          <w:lang w:val="en-US" w:eastAsia="zh-CN" w:bidi="hi-IN"/>
+        </w:rPr>
+        <w:t xml:space="preserve"> em evolução e comprometer-se com o </w:t>
+      </w:r>
+      <w:r>
+        <w:rPr>
+          <w:rFonts w:eastAsia="Times New Roman" w:cs="Times New Roman" w:ascii="Garamond" w:hAnsi="Garamond"/>
+          <w:color w:val="000000"/>
+          <w:kern w:val="0"/>
+          <w:sz w:val="36"/>
+          <w:szCs w:val="36"/>
+          <w:shd w:fill="FFFF00" w:val="clear"/>
+          <w:lang w:val="en-US" w:eastAsia="zh-CN" w:bidi="hi-IN"/>
+        </w:rPr>
+        <w:t>próprio aperfeiçoamento</w:t>
+      </w:r>
+      <w:r>
+        <w:rPr>
+          <w:rFonts w:eastAsia="Times New Roman" w:cs="Times New Roman" w:ascii="Garamond" w:hAnsi="Garamond"/>
+          <w:color w:val="000000"/>
+          <w:kern w:val="0"/>
+          <w:sz w:val="36"/>
+          <w:szCs w:val="36"/>
+          <w:shd w:fill="auto" w:val="clear"/>
+          <w:lang w:val="en-US" w:eastAsia="zh-CN" w:bidi="hi-IN"/>
+        </w:rPr>
+        <w:t xml:space="preserve">, aprendendo com os </w:t>
+      </w:r>
+      <w:r>
+        <w:rPr>
+          <w:rFonts w:eastAsia="Times New Roman" w:cs="Times New Roman" w:ascii="Garamond" w:hAnsi="Garamond"/>
+          <w:color w:val="000000"/>
+          <w:kern w:val="0"/>
+          <w:sz w:val="36"/>
+          <w:szCs w:val="36"/>
+          <w:shd w:fill="FFFF00" w:val="clear"/>
+          <w:lang w:val="en-US" w:eastAsia="zh-CN" w:bidi="hi-IN"/>
+        </w:rPr>
+        <w:t>erros</w:t>
+      </w:r>
+      <w:r>
+        <w:rPr>
+          <w:rFonts w:eastAsia="Times New Roman" w:cs="Times New Roman" w:ascii="Garamond" w:hAnsi="Garamond"/>
+          <w:color w:val="000000"/>
+          <w:kern w:val="0"/>
+          <w:sz w:val="36"/>
+          <w:szCs w:val="36"/>
+          <w:shd w:fill="auto" w:val="clear"/>
+          <w:lang w:val="en-US" w:eastAsia="zh-CN" w:bidi="hi-IN"/>
+        </w:rPr>
+        <w:t xml:space="preserve"> e confiando na </w:t>
+      </w:r>
+      <w:r>
+        <w:rPr>
+          <w:rFonts w:eastAsia="Times New Roman" w:cs="Times New Roman" w:ascii="Garamond" w:hAnsi="Garamond"/>
+          <w:color w:val="000000"/>
+          <w:kern w:val="0"/>
+          <w:sz w:val="36"/>
+          <w:szCs w:val="36"/>
+          <w:shd w:fill="FFFF00" w:val="clear"/>
+          <w:lang w:val="en-US" w:eastAsia="zh-CN" w:bidi="hi-IN"/>
+        </w:rPr>
+        <w:t>misericórdia divina</w:t>
+      </w:r>
+      <w:r>
+        <w:rPr>
+          <w:rFonts w:eastAsia="Times New Roman" w:cs="Times New Roman" w:ascii="Garamond" w:hAnsi="Garamond"/>
+          <w:color w:val="000000"/>
+          <w:kern w:val="0"/>
+          <w:sz w:val="36"/>
+          <w:szCs w:val="36"/>
+          <w:shd w:fill="auto" w:val="clear"/>
+          <w:lang w:val="en-US" w:eastAsia="zh-CN" w:bidi="hi-IN"/>
+        </w:rPr>
+        <w:t xml:space="preserve"> para seguir adiante.</w:t>
       </w:r>
     </w:p>
     <w:p>
@@ -12931,155 +12987,6 @@
           <w:shd w:fill="auto" w:val="clear"/>
           <w:lang w:val="en-US" w:eastAsia="zh-CN" w:bidi="hi-IN"/>
         </w:rPr>
-        <w:t xml:space="preserve">Amar a si mesmo é </w:t>
-      </w:r>
-      <w:r>
-        <w:rPr>
-          <w:rFonts w:eastAsia="Times New Roman" w:cs="Times New Roman" w:ascii="Garamond" w:hAnsi="Garamond"/>
-          <w:color w:val="000000"/>
-          <w:kern w:val="0"/>
-          <w:sz w:val="36"/>
-          <w:szCs w:val="36"/>
-          <w:shd w:fill="FFFF00" w:val="clear"/>
-          <w:lang w:val="en-US" w:eastAsia="zh-CN" w:bidi="hi-IN"/>
-        </w:rPr>
-        <w:t>reconhecer-se como espírito imortal</w:t>
-      </w:r>
-      <w:r>
-        <w:rPr>
-          <w:rFonts w:eastAsia="Times New Roman" w:cs="Times New Roman" w:ascii="Garamond" w:hAnsi="Garamond"/>
-          <w:color w:val="000000"/>
-          <w:kern w:val="0"/>
-          <w:sz w:val="36"/>
-          <w:szCs w:val="36"/>
-          <w:shd w:fill="auto" w:val="clear"/>
-          <w:lang w:val="en-US" w:eastAsia="zh-CN" w:bidi="hi-IN"/>
-        </w:rPr>
-        <w:t xml:space="preserve"> em evolução e comprometer-se com o </w:t>
-      </w:r>
-      <w:r>
-        <w:rPr>
-          <w:rFonts w:eastAsia="Times New Roman" w:cs="Times New Roman" w:ascii="Garamond" w:hAnsi="Garamond"/>
-          <w:color w:val="000000"/>
-          <w:kern w:val="0"/>
-          <w:sz w:val="36"/>
-          <w:szCs w:val="36"/>
-          <w:shd w:fill="FFFF00" w:val="clear"/>
-          <w:lang w:val="en-US" w:eastAsia="zh-CN" w:bidi="hi-IN"/>
-        </w:rPr>
-        <w:t>próprio aperfeiçoamento</w:t>
-      </w:r>
-      <w:r>
-        <w:rPr>
-          <w:rFonts w:eastAsia="Times New Roman" w:cs="Times New Roman" w:ascii="Garamond" w:hAnsi="Garamond"/>
-          <w:color w:val="000000"/>
-          <w:kern w:val="0"/>
-          <w:sz w:val="36"/>
-          <w:szCs w:val="36"/>
-          <w:shd w:fill="auto" w:val="clear"/>
-          <w:lang w:val="en-US" w:eastAsia="zh-CN" w:bidi="hi-IN"/>
-        </w:rPr>
-        <w:t xml:space="preserve">, aprendendo com os </w:t>
-      </w:r>
-      <w:r>
-        <w:rPr>
-          <w:rFonts w:eastAsia="Times New Roman" w:cs="Times New Roman" w:ascii="Garamond" w:hAnsi="Garamond"/>
-          <w:color w:val="000000"/>
-          <w:kern w:val="0"/>
-          <w:sz w:val="36"/>
-          <w:szCs w:val="36"/>
-          <w:shd w:fill="FFFF00" w:val="clear"/>
-          <w:lang w:val="en-US" w:eastAsia="zh-CN" w:bidi="hi-IN"/>
-        </w:rPr>
-        <w:t>erros</w:t>
-      </w:r>
-      <w:r>
-        <w:rPr>
-          <w:rFonts w:eastAsia="Times New Roman" w:cs="Times New Roman" w:ascii="Garamond" w:hAnsi="Garamond"/>
-          <w:color w:val="000000"/>
-          <w:kern w:val="0"/>
-          <w:sz w:val="36"/>
-          <w:szCs w:val="36"/>
-          <w:shd w:fill="auto" w:val="clear"/>
-          <w:lang w:val="en-US" w:eastAsia="zh-CN" w:bidi="hi-IN"/>
-        </w:rPr>
-        <w:t xml:space="preserve"> e confiando na </w:t>
-      </w:r>
-      <w:r>
-        <w:rPr>
-          <w:rFonts w:eastAsia="Times New Roman" w:cs="Times New Roman" w:ascii="Garamond" w:hAnsi="Garamond"/>
-          <w:color w:val="000000"/>
-          <w:kern w:val="0"/>
-          <w:sz w:val="36"/>
-          <w:szCs w:val="36"/>
-          <w:shd w:fill="FFFF00" w:val="clear"/>
-          <w:lang w:val="en-US" w:eastAsia="zh-CN" w:bidi="hi-IN"/>
-        </w:rPr>
-        <w:t>misericórdia divina</w:t>
-      </w:r>
-      <w:r>
-        <w:rPr>
-          <w:rFonts w:eastAsia="Times New Roman" w:cs="Times New Roman" w:ascii="Garamond" w:hAnsi="Garamond"/>
-          <w:color w:val="000000"/>
-          <w:kern w:val="0"/>
-          <w:sz w:val="36"/>
-          <w:szCs w:val="36"/>
-          <w:shd w:fill="auto" w:val="clear"/>
-          <w:lang w:val="en-US" w:eastAsia="zh-CN" w:bidi="hi-IN"/>
-        </w:rPr>
-        <w:t xml:space="preserve"> para seguir adiante.</w:t>
-      </w:r>
-    </w:p>
-    <w:p>
-      <w:pPr>
-        <w:pStyle w:val="Normal"/>
-        <w:jc w:val="both"/>
-        <w:rPr>
-          <w:rFonts w:ascii="Garamond" w:hAnsi="Garamond" w:eastAsia="Times New Roman" w:cs="Times New Roman"/>
-          <w:color w:val="auto"/>
-          <w:kern w:val="0"/>
-          <w:sz w:val="36"/>
-          <w:szCs w:val="36"/>
-          <w:shd w:fill="auto" w:val="clear"/>
-          <w:lang w:val="en-US" w:eastAsia="zh-CN" w:bidi="hi-IN"/>
-        </w:rPr>
-      </w:pPr>
-      <w:r>
-        <w:rPr>
-          <w:rFonts w:eastAsia="Times New Roman" w:cs="Times New Roman" w:ascii="Garamond" w:hAnsi="Garamond"/>
-          <w:color w:val="000000"/>
-          <w:kern w:val="0"/>
-          <w:sz w:val="36"/>
-          <w:szCs w:val="36"/>
-          <w:shd w:fill="auto" w:val="clear"/>
-          <w:lang w:val="en-US" w:eastAsia="zh-CN" w:bidi="hi-IN"/>
-        </w:rPr>
-      </w:r>
-    </w:p>
-    <w:p>
-      <w:pPr>
-        <w:pStyle w:val="Normal"/>
-        <w:jc w:val="both"/>
-        <w:rPr>
-          <w:rFonts w:ascii="Garamond" w:hAnsi="Garamond" w:eastAsia="Times New Roman" w:cs="Times New Roman"/>
-          <w:color w:val="auto"/>
-          <w:kern w:val="0"/>
-          <w:sz w:val="36"/>
-          <w:szCs w:val="36"/>
-          <w:shd w:fill="auto" w:val="clear"/>
-          <w:lang w:val="en-US" w:eastAsia="zh-CN" w:bidi="hi-IN"/>
-        </w:rPr>
-      </w:pPr>
-      <w:r>
-        <w:rPr>
-          <w:rFonts w:eastAsia="Times New Roman" w:cs="Times New Roman" w:ascii="Garamond" w:hAnsi="Garamond"/>
-          <w:color w:val="000000"/>
-          <w:kern w:val="0"/>
-          <w:sz w:val="36"/>
-          <w:szCs w:val="36"/>
-          <w:shd w:fill="auto" w:val="clear"/>
-          <w:lang w:val="en-US" w:eastAsia="zh-CN" w:bidi="hi-IN"/>
-        </w:rPr>
         <w:t>Há uma última questão que precisamos abordar e que é tão importante quanto tudo o que foi dito até agora.</w:t>
       </w:r>
     </w:p>
@@ -13098,7 +13005,15 @@
         </w:rPr>
       </w:pPr>
       <w:r>
-        <w:rPr/>
+        <w:rPr>
+          <w:rFonts w:eastAsia="Times New Roman" w:cs="Times New Roman" w:ascii="Garamond" w:hAnsi="Garamond"/>
+          <w:color w:val="000000"/>
+          <w:kern w:val="0"/>
+          <w:sz w:val="36"/>
+          <w:szCs w:val="36"/>
+          <w:shd w:fill="auto" w:val="clear"/>
+          <w:lang w:val="en-US" w:eastAsia="zh-CN" w:bidi="hi-IN"/>
+        </w:rPr>
       </w:r>
     </w:p>
     <w:p>
@@ -13456,19 +13371,7 @@
           <w:shd w:fill="auto" w:val="clear"/>
           <w:lang w:val="en-US" w:eastAsia="zh-CN" w:bidi="hi-IN"/>
         </w:rPr>
-        <w:t>E</w:t>
-      </w:r>
-      <w:r>
-        <w:rPr>
-          <w:rFonts w:eastAsia="Times New Roman" w:cs="Times New Roman" w:ascii="Garamond" w:hAnsi="Garamond"/>
-          <w:color w:val="000000"/>
-          <w:kern w:val="0"/>
-          <w:sz w:val="36"/>
-          <w:szCs w:val="36"/>
-          <w:shd w:fill="auto" w:val="clear"/>
-          <w:lang w:val="en-US" w:eastAsia="zh-CN" w:bidi="hi-IN"/>
-        </w:rPr>
-        <w:t xml:space="preserve"> esse </w:t>
+        <w:t xml:space="preserve">E esse </w:t>
       </w:r>
       <w:r>
         <w:rPr>
@@ -13558,58 +13461,42 @@
         </w:rPr>
       </w:pPr>
       <w:r>
-        <w:rPr/>
-      </w:r>
-    </w:p>
-    <w:p>
-      <w:pPr>
-        <w:pStyle w:val="Normal"/>
-        <w:jc w:val="both"/>
-        <w:rPr>
-          <w:rFonts w:ascii="Garamond" w:hAnsi="Garamond" w:eastAsia="Times New Roman" w:cs="Times New Roman"/>
-          <w:color w:val="000000"/>
-          <w:kern w:val="0"/>
-          <w:sz w:val="36"/>
-          <w:szCs w:val="36"/>
-          <w:shd w:fill="auto" w:val="clear"/>
-          <w:lang w:val="en-US" w:eastAsia="zh-CN" w:bidi="hi-IN"/>
-        </w:rPr>
-      </w:pPr>
-      <w:r>
-        <w:rPr>
-          <w:rFonts w:eastAsia="Times New Roman" w:cs="Times New Roman" w:ascii="Garamond" w:hAnsi="Garamond"/>
-          <w:color w:val="000000"/>
-          <w:kern w:val="0"/>
-          <w:sz w:val="36"/>
-          <w:szCs w:val="36"/>
-          <w:shd w:fill="auto" w:val="clear"/>
-          <w:lang w:val="en-US" w:eastAsia="zh-CN" w:bidi="hi-IN"/>
-        </w:rPr>
-        <w:t>Nós</w:t>
-      </w:r>
-      <w:r>
-        <w:rPr>
-          <w:rFonts w:eastAsia="Times New Roman" w:cs="Times New Roman" w:ascii="Garamond" w:hAnsi="Garamond"/>
-          <w:color w:val="000000"/>
-          <w:kern w:val="0"/>
-          <w:sz w:val="36"/>
-          <w:szCs w:val="36"/>
-          <w:shd w:fill="auto" w:val="clear"/>
-          <w:lang w:val="en-US" w:eastAsia="zh-CN" w:bidi="hi-IN"/>
-        </w:rPr>
-        <w:t xml:space="preserve"> olhamos para tudo isso e</w:t>
-      </w:r>
-      <w:r>
-        <w:rPr>
-          <w:rFonts w:eastAsia="Times New Roman" w:cs="Times New Roman" w:ascii="Garamond" w:hAnsi="Garamond"/>
-          <w:color w:val="000000"/>
-          <w:kern w:val="0"/>
-          <w:sz w:val="36"/>
-          <w:szCs w:val="36"/>
-          <w:shd w:fill="auto" w:val="clear"/>
-          <w:lang w:val="en-US" w:eastAsia="zh-CN" w:bidi="hi-IN"/>
-        </w:rPr>
-        <w:t xml:space="preserve"> dizemos: "Não é possível que a humanidade esteja realmente evoluindo. </w:t>
+        <w:rPr>
+          <w:rFonts w:eastAsia="Times New Roman" w:cs="Times New Roman" w:ascii="Garamond" w:hAnsi="Garamond"/>
+          <w:color w:val="000000"/>
+          <w:kern w:val="0"/>
+          <w:sz w:val="36"/>
+          <w:szCs w:val="36"/>
+          <w:shd w:fill="auto" w:val="clear"/>
+          <w:lang w:val="en-US" w:eastAsia="zh-CN" w:bidi="hi-IN"/>
+        </w:rPr>
+      </w:r>
+    </w:p>
+    <w:p>
+      <w:pPr>
+        <w:pStyle w:val="Normal"/>
+        <w:jc w:val="both"/>
+        <w:rPr>
+          <w:rFonts w:ascii="Garamond" w:hAnsi="Garamond" w:eastAsia="Times New Roman" w:cs="Times New Roman"/>
+          <w:color w:val="000000"/>
+          <w:kern w:val="0"/>
+          <w:sz w:val="36"/>
+          <w:szCs w:val="36"/>
+          <w:shd w:fill="auto" w:val="clear"/>
+          <w:lang w:val="en-US" w:eastAsia="zh-CN" w:bidi="hi-IN"/>
+        </w:rPr>
+      </w:pPr>
+      <w:r>
+        <w:rPr>
+          <w:rFonts w:eastAsia="Times New Roman" w:cs="Times New Roman" w:ascii="Garamond" w:hAnsi="Garamond"/>
+          <w:color w:val="000000"/>
+          <w:kern w:val="0"/>
+          <w:sz w:val="36"/>
+          <w:szCs w:val="36"/>
+          <w:shd w:fill="auto" w:val="clear"/>
+          <w:lang w:val="en-US" w:eastAsia="zh-CN" w:bidi="hi-IN"/>
+        </w:rPr>
+        <w:t xml:space="preserve">Nós olhamos para tudo isso e dizemos: "Não é possível que a humanidade esteja realmente evoluindo. </w:t>
       </w:r>
       <w:r>
         <w:rPr>
@@ -13651,70 +13538,54 @@
         </w:rPr>
       </w:pPr>
       <w:r>
-        <w:rPr/>
-      </w:r>
-    </w:p>
-    <w:p>
-      <w:pPr>
-        <w:pStyle w:val="Normal"/>
-        <w:jc w:val="both"/>
-        <w:rPr>
-          <w:rFonts w:ascii="Garamond" w:hAnsi="Garamond" w:eastAsia="Times New Roman" w:cs="Times New Roman"/>
-          <w:color w:val="000000"/>
-          <w:kern w:val="0"/>
-          <w:sz w:val="36"/>
-          <w:szCs w:val="36"/>
-          <w:shd w:fill="auto" w:val="clear"/>
-          <w:lang w:val="en-US" w:eastAsia="zh-CN" w:bidi="hi-IN"/>
-        </w:rPr>
-      </w:pPr>
-      <w:r>
-        <w:rPr>
-          <w:rFonts w:eastAsia="Times New Roman" w:cs="Times New Roman" w:ascii="Garamond" w:hAnsi="Garamond"/>
-          <w:color w:val="000000"/>
-          <w:kern w:val="0"/>
-          <w:sz w:val="36"/>
-          <w:szCs w:val="36"/>
-          <w:shd w:fill="auto" w:val="clear"/>
-          <w:lang w:val="en-US" w:eastAsia="zh-CN" w:bidi="hi-IN"/>
-        </w:rPr>
-        <w:t xml:space="preserve">Essa forma de pensar mostra </w:t>
-      </w:r>
-      <w:r>
-        <w:rPr>
-          <w:rFonts w:eastAsia="Times New Roman" w:cs="Times New Roman" w:ascii="Garamond" w:hAnsi="Garamond"/>
-          <w:color w:val="000000"/>
-          <w:kern w:val="0"/>
-          <w:sz w:val="36"/>
-          <w:szCs w:val="36"/>
-          <w:shd w:fill="auto" w:val="clear"/>
-          <w:lang w:val="en-US" w:eastAsia="zh-CN" w:bidi="hi-IN"/>
-        </w:rPr>
-        <w:t xml:space="preserve">como é </w:t>
-      </w:r>
-      <w:r>
-        <w:rPr>
-          <w:rFonts w:eastAsia="Times New Roman" w:cs="Times New Roman" w:ascii="Garamond" w:hAnsi="Garamond"/>
-          <w:color w:val="000000"/>
-          <w:kern w:val="0"/>
-          <w:sz w:val="36"/>
-          <w:szCs w:val="36"/>
-          <w:shd w:fill="FFFF00" w:val="clear"/>
-          <w:lang w:val="en-US" w:eastAsia="zh-CN" w:bidi="hi-IN"/>
-        </w:rPr>
-        <w:t>l</w:t>
-      </w:r>
-      <w:r>
-        <w:rPr>
-          <w:rFonts w:eastAsia="Times New Roman" w:cs="Times New Roman" w:ascii="Garamond" w:hAnsi="Garamond"/>
-          <w:color w:val="000000"/>
-          <w:kern w:val="0"/>
-          <w:sz w:val="36"/>
-          <w:szCs w:val="36"/>
-          <w:shd w:fill="FFFF00" w:val="clear"/>
-          <w:lang w:val="en-US" w:eastAsia="zh-CN" w:bidi="hi-IN"/>
-        </w:rPr>
-        <w:t>imitada nossa visão</w:t>
+        <w:rPr>
+          <w:rFonts w:eastAsia="Times New Roman" w:cs="Times New Roman" w:ascii="Garamond" w:hAnsi="Garamond"/>
+          <w:color w:val="000000"/>
+          <w:kern w:val="0"/>
+          <w:sz w:val="36"/>
+          <w:szCs w:val="36"/>
+          <w:shd w:fill="auto" w:val="clear"/>
+          <w:lang w:val="en-US" w:eastAsia="zh-CN" w:bidi="hi-IN"/>
+        </w:rPr>
+      </w:r>
+    </w:p>
+    <w:p>
+      <w:pPr>
+        <w:pStyle w:val="Normal"/>
+        <w:jc w:val="both"/>
+        <w:rPr>
+          <w:rFonts w:ascii="Garamond" w:hAnsi="Garamond" w:eastAsia="Times New Roman" w:cs="Times New Roman"/>
+          <w:color w:val="000000"/>
+          <w:kern w:val="0"/>
+          <w:sz w:val="36"/>
+          <w:szCs w:val="36"/>
+          <w:shd w:fill="auto" w:val="clear"/>
+          <w:lang w:val="en-US" w:eastAsia="zh-CN" w:bidi="hi-IN"/>
+        </w:rPr>
+      </w:pPr>
+      <w:r>
+        <w:rPr>
+          <w:rFonts w:eastAsia="Times New Roman" w:cs="Times New Roman" w:ascii="Garamond" w:hAnsi="Garamond"/>
+          <w:color w:val="000000"/>
+          <w:kern w:val="0"/>
+          <w:sz w:val="36"/>
+          <w:szCs w:val="36"/>
+          <w:shd w:fill="auto" w:val="clear"/>
+          <w:lang w:val="en-US" w:eastAsia="zh-CN" w:bidi="hi-IN"/>
+        </w:rPr>
+        <w:t xml:space="preserve">Essa forma de pensar mostra como é </w:t>
+      </w:r>
+      <w:r>
+        <w:rPr>
+          <w:rFonts w:eastAsia="Times New Roman" w:cs="Times New Roman" w:ascii="Garamond" w:hAnsi="Garamond"/>
+          <w:color w:val="000000"/>
+          <w:kern w:val="0"/>
+          <w:sz w:val="36"/>
+          <w:szCs w:val="36"/>
+          <w:shd w:fill="FFFF00" w:val="clear"/>
+          <w:lang w:val="en-US" w:eastAsia="zh-CN" w:bidi="hi-IN"/>
+        </w:rPr>
+        <w:t>limitada nossa visão</w:t>
       </w:r>
       <w:r>
         <w:rPr>
@@ -13750,31 +13621,7 @@
           <w:shd w:fill="auto" w:val="clear"/>
           <w:lang w:val="en-US" w:eastAsia="zh-CN" w:bidi="hi-IN"/>
         </w:rPr>
-        <w:t xml:space="preserve">. Apesar de termos o livre arbítrio, todas as coisas sempre </w:t>
-      </w:r>
-      <w:r>
-        <w:rPr>
-          <w:rFonts w:eastAsia="Times New Roman" w:cs="Times New Roman" w:ascii="Garamond" w:hAnsi="Garamond"/>
-          <w:color w:val="000000"/>
-          <w:kern w:val="0"/>
-          <w:sz w:val="36"/>
-          <w:szCs w:val="36"/>
-          <w:shd w:fill="auto" w:val="clear"/>
-          <w:lang w:val="en-US" w:eastAsia="zh-CN" w:bidi="hi-IN"/>
-        </w:rPr>
-        <w:t xml:space="preserve">aconteceram, </w:t>
-      </w:r>
-      <w:r>
-        <w:rPr>
-          <w:rFonts w:eastAsia="Times New Roman" w:cs="Times New Roman" w:ascii="Garamond" w:hAnsi="Garamond"/>
-          <w:color w:val="000000"/>
-          <w:kern w:val="0"/>
-          <w:sz w:val="36"/>
-          <w:szCs w:val="36"/>
-          <w:shd w:fill="auto" w:val="clear"/>
-          <w:lang w:val="en-US" w:eastAsia="zh-CN" w:bidi="hi-IN"/>
-        </w:rPr>
-        <w:t xml:space="preserve">acontecem e acontecerão de </w:t>
+        <w:t xml:space="preserve">. Apesar de termos o livre arbítrio, todas as coisas sempre aconteceram, acontecem e acontecerão de </w:t>
       </w:r>
       <w:r>
         <w:rPr>
@@ -13863,31 +13710,7 @@
           <w:shd w:fill="auto" w:val="clear"/>
           <w:lang w:val="en-US" w:eastAsia="zh-CN" w:bidi="hi-IN"/>
         </w:rPr>
-        <w:t xml:space="preserve"> para elevar-se um pouco mais, pode</w:t>
-      </w:r>
-      <w:r>
-        <w:rPr>
-          <w:rFonts w:eastAsia="Times New Roman" w:cs="Times New Roman" w:ascii="Garamond" w:hAnsi="Garamond"/>
-          <w:color w:val="000000"/>
-          <w:kern w:val="0"/>
-          <w:sz w:val="36"/>
-          <w:szCs w:val="36"/>
-          <w:shd w:fill="auto" w:val="clear"/>
-          <w:lang w:val="en-US" w:eastAsia="zh-CN" w:bidi="hi-IN"/>
-        </w:rPr>
-        <w:t>-se</w:t>
-      </w:r>
-      <w:r>
-        <w:rPr>
-          <w:rFonts w:eastAsia="Times New Roman" w:cs="Times New Roman" w:ascii="Garamond" w:hAnsi="Garamond"/>
-          <w:color w:val="000000"/>
-          <w:kern w:val="0"/>
-          <w:sz w:val="36"/>
-          <w:szCs w:val="36"/>
-          <w:shd w:fill="auto" w:val="clear"/>
-          <w:lang w:val="en-US" w:eastAsia="zh-CN" w:bidi="hi-IN"/>
-        </w:rPr>
-        <w:t xml:space="preserve"> dizer que são </w:t>
+        <w:t xml:space="preserve"> para elevar-se um pouco mais, pode-se dizer que são </w:t>
       </w:r>
       <w:r>
         <w:rPr>
@@ -14030,7 +13853,15 @@
         </w:rPr>
       </w:pPr>
       <w:r>
-        <w:rPr/>
+        <w:rPr>
+          <w:rFonts w:eastAsia="Times New Roman" w:cs="Times New Roman" w:ascii="Garamond" w:hAnsi="Garamond"/>
+          <w:color w:val="000000"/>
+          <w:kern w:val="0"/>
+          <w:sz w:val="36"/>
+          <w:szCs w:val="36"/>
+          <w:shd w:fill="auto" w:val="clear"/>
+          <w:lang w:val="en-US" w:eastAsia="zh-CN" w:bidi="hi-IN"/>
+        </w:rPr>
       </w:r>
     </w:p>
     <w:p>
@@ -14147,7 +13978,15 @@
         </w:rPr>
       </w:pPr>
       <w:r>
-        <w:rPr/>
+        <w:rPr>
+          <w:rFonts w:eastAsia="Times New Roman" w:cs="Times New Roman" w:ascii="Garamond" w:hAnsi="Garamond"/>
+          <w:color w:val="000000"/>
+          <w:kern w:val="0"/>
+          <w:sz w:val="36"/>
+          <w:szCs w:val="36"/>
+          <w:shd w:fill="auto" w:val="clear"/>
+          <w:lang w:val="en-US" w:eastAsia="zh-CN" w:bidi="hi-IN"/>
+        </w:rPr>
       </w:r>
     </w:p>
     <w:p>
@@ -14210,31 +14049,7 @@
           <w:shd w:fill="FFFF00" w:val="clear"/>
           <w:lang w:val="en-US" w:eastAsia="zh-CN" w:bidi="hi-IN"/>
         </w:rPr>
-        <w:t xml:space="preserve">voltar </w:t>
-      </w:r>
-      <w:r>
-        <w:rPr>
-          <w:rFonts w:eastAsia="Times New Roman" w:cs="Times New Roman" w:ascii="Garamond" w:hAnsi="Garamond"/>
-          <w:color w:val="000000"/>
-          <w:kern w:val="0"/>
-          <w:sz w:val="36"/>
-          <w:szCs w:val="36"/>
-          <w:shd w:fill="FFFF00" w:val="clear"/>
-          <w:lang w:val="en-US" w:eastAsia="zh-CN" w:bidi="hi-IN"/>
-        </w:rPr>
-        <w:t>os</w:t>
-      </w:r>
-      <w:r>
-        <w:rPr>
-          <w:rFonts w:eastAsia="Times New Roman" w:cs="Times New Roman" w:ascii="Garamond" w:hAnsi="Garamond"/>
-          <w:color w:val="000000"/>
-          <w:kern w:val="0"/>
-          <w:sz w:val="36"/>
-          <w:szCs w:val="36"/>
-          <w:shd w:fill="FFFF00" w:val="clear"/>
-          <w:lang w:val="en-US" w:eastAsia="zh-CN" w:bidi="hi-IN"/>
-        </w:rPr>
-        <w:t xml:space="preserve"> olhares para a realidade do nosso país</w:t>
+        <w:t>voltar os olhares para a realidade do nosso país</w:t>
       </w:r>
       <w:r>
         <w:rPr>
@@ -14768,7 +14583,15 @@
         </w:rPr>
       </w:pPr>
       <w:r>
-        <w:rPr/>
+        <w:rPr>
+          <w:rFonts w:eastAsia="Times New Roman" w:cs="Times New Roman" w:ascii="Garamond" w:hAnsi="Garamond"/>
+          <w:color w:val="000000"/>
+          <w:kern w:val="0"/>
+          <w:sz w:val="36"/>
+          <w:szCs w:val="36"/>
+          <w:shd w:fill="auto" w:val="clear"/>
+          <w:lang w:val="en-US" w:eastAsia="zh-CN" w:bidi="hi-IN"/>
+        </w:rPr>
       </w:r>
       <w:r>
         <w:br w:type="page"/>
@@ -14888,7 +14711,15 @@
         </w:rPr>
       </w:pPr>
       <w:r>
-        <w:rPr/>
+        <w:rPr>
+          <w:rFonts w:eastAsia="Times New Roman" w:cs="Times New Roman" w:ascii="Garamond" w:hAnsi="Garamond"/>
+          <w:color w:val="000000"/>
+          <w:kern w:val="0"/>
+          <w:sz w:val="36"/>
+          <w:szCs w:val="36"/>
+          <w:shd w:fill="auto" w:val="clear"/>
+          <w:lang w:val="en-US" w:eastAsia="zh-CN" w:bidi="hi-IN"/>
+        </w:rPr>
       </w:r>
     </w:p>
     <w:p>
@@ -14951,55 +14782,7 @@
           <w:shd w:fill="FFFF00" w:val="clear"/>
           <w:lang w:val="en-US" w:eastAsia="zh-CN" w:bidi="hi-IN"/>
         </w:rPr>
-        <w:t>aqueles povos</w:t>
-      </w:r>
-      <w:r>
-        <w:rPr>
-          <w:rFonts w:eastAsia="Times New Roman" w:cs="Times New Roman" w:ascii="Garamond" w:hAnsi="Garamond"/>
-          <w:color w:val="000000"/>
-          <w:kern w:val="0"/>
-          <w:sz w:val="36"/>
-          <w:szCs w:val="36"/>
-          <w:shd w:fill="FFFF00" w:val="clear"/>
-          <w:lang w:val="en-US" w:eastAsia="zh-CN" w:bidi="hi-IN"/>
-        </w:rPr>
-        <w:t xml:space="preserve"> </w:t>
-      </w:r>
-      <w:r>
-        <w:rPr>
-          <w:rFonts w:eastAsia="Times New Roman" w:cs="Times New Roman" w:ascii="Garamond" w:hAnsi="Garamond"/>
-          <w:color w:val="000000"/>
-          <w:kern w:val="0"/>
-          <w:sz w:val="36"/>
-          <w:szCs w:val="36"/>
-          <w:shd w:fill="FFFF00" w:val="clear"/>
-          <w:lang w:val="en-US" w:eastAsia="zh-CN" w:bidi="hi-IN"/>
-        </w:rPr>
-        <w:t xml:space="preserve">já não vivam mais sob </w:t>
-      </w:r>
-      <w:r>
-        <w:rPr>
-          <w:rFonts w:eastAsia="Times New Roman" w:cs="Times New Roman" w:ascii="Garamond" w:hAnsi="Garamond"/>
-          <w:color w:val="000000"/>
-          <w:kern w:val="0"/>
-          <w:sz w:val="36"/>
-          <w:szCs w:val="36"/>
-          <w:shd w:fill="FFFF00" w:val="clear"/>
-          <w:lang w:val="en-US" w:eastAsia="zh-CN" w:bidi="hi-IN"/>
-        </w:rPr>
-        <w:t>Seus</w:t>
-      </w:r>
-      <w:r>
-        <w:rPr>
-          <w:rFonts w:eastAsia="Times New Roman" w:cs="Times New Roman" w:ascii="Garamond" w:hAnsi="Garamond"/>
-          <w:color w:val="000000"/>
-          <w:kern w:val="0"/>
-          <w:sz w:val="36"/>
-          <w:szCs w:val="36"/>
-          <w:shd w:fill="FFFF00" w:val="clear"/>
-          <w:lang w:val="en-US" w:eastAsia="zh-CN" w:bidi="hi-IN"/>
-        </w:rPr>
-        <w:t xml:space="preserve"> ensinamentos</w:t>
+        <w:t>aqueles povos já não vivam mais sob Seus ensinamentos</w:t>
       </w:r>
       <w:r>
         <w:rPr>
@@ -15258,46 +15041,42 @@
         </w:rPr>
       </w:pPr>
       <w:r>
-        <w:rPr/>
-      </w:r>
-    </w:p>
-    <w:p>
-      <w:pPr>
-        <w:pStyle w:val="Normal"/>
-        <w:jc w:val="both"/>
-        <w:rPr>
-          <w:rFonts w:ascii="Garamond" w:hAnsi="Garamond" w:eastAsia="Times New Roman" w:cs="Times New Roman"/>
-          <w:color w:val="000000"/>
-          <w:kern w:val="0"/>
-          <w:sz w:val="36"/>
-          <w:szCs w:val="36"/>
-          <w:shd w:fill="auto" w:val="clear"/>
-          <w:lang w:val="en-US" w:eastAsia="zh-CN" w:bidi="hi-IN"/>
-        </w:rPr>
-      </w:pPr>
-      <w:r>
-        <w:rPr>
-          <w:rFonts w:eastAsia="Times New Roman" w:cs="Times New Roman" w:ascii="Garamond" w:hAnsi="Garamond"/>
-          <w:color w:val="000000"/>
-          <w:kern w:val="0"/>
-          <w:sz w:val="36"/>
-          <w:szCs w:val="36"/>
-          <w:shd w:fill="auto" w:val="clear"/>
-          <w:lang w:val="en-US" w:eastAsia="zh-CN" w:bidi="hi-IN"/>
-        </w:rPr>
-        <w:t>Mais uma vez, n</w:t>
-      </w:r>
-      <w:r>
-        <w:rPr>
-          <w:rFonts w:eastAsia="Times New Roman" w:cs="Times New Roman" w:ascii="Garamond" w:hAnsi="Garamond"/>
-          <w:color w:val="000000"/>
-          <w:kern w:val="0"/>
-          <w:sz w:val="36"/>
-          <w:szCs w:val="36"/>
-          <w:shd w:fill="auto" w:val="clear"/>
-          <w:lang w:val="en-US" w:eastAsia="zh-CN" w:bidi="hi-IN"/>
-        </w:rPr>
-        <w:t xml:space="preserve">ós olhamos para tudo isso e dizemos: </w:t>
+        <w:rPr>
+          <w:rFonts w:eastAsia="Times New Roman" w:cs="Times New Roman" w:ascii="Garamond" w:hAnsi="Garamond"/>
+          <w:color w:val="000000"/>
+          <w:kern w:val="0"/>
+          <w:sz w:val="36"/>
+          <w:szCs w:val="36"/>
+          <w:shd w:fill="auto" w:val="clear"/>
+          <w:lang w:val="en-US" w:eastAsia="zh-CN" w:bidi="hi-IN"/>
+        </w:rPr>
+      </w:r>
+    </w:p>
+    <w:p>
+      <w:pPr>
+        <w:pStyle w:val="Normal"/>
+        <w:jc w:val="both"/>
+        <w:rPr>
+          <w:rFonts w:ascii="Garamond" w:hAnsi="Garamond" w:eastAsia="Times New Roman" w:cs="Times New Roman"/>
+          <w:color w:val="000000"/>
+          <w:kern w:val="0"/>
+          <w:sz w:val="36"/>
+          <w:szCs w:val="36"/>
+          <w:shd w:fill="auto" w:val="clear"/>
+          <w:lang w:val="en-US" w:eastAsia="zh-CN" w:bidi="hi-IN"/>
+        </w:rPr>
+      </w:pPr>
+      <w:r>
+        <w:rPr>
+          <w:rFonts w:eastAsia="Times New Roman" w:cs="Times New Roman" w:ascii="Garamond" w:hAnsi="Garamond"/>
+          <w:color w:val="000000"/>
+          <w:kern w:val="0"/>
+          <w:sz w:val="36"/>
+          <w:szCs w:val="36"/>
+          <w:shd w:fill="auto" w:val="clear"/>
+          <w:lang w:val="en-US" w:eastAsia="zh-CN" w:bidi="hi-IN"/>
+        </w:rPr>
+        <w:t xml:space="preserve">Mais uma vez, nós olhamos para tudo isso e dizemos: </w:t>
       </w:r>
       <w:r>
         <w:rPr>
@@ -15398,19 +15177,7 @@
           <w:shd w:fill="auto" w:val="clear"/>
           <w:lang w:val="en-US" w:eastAsia="zh-CN" w:bidi="hi-IN"/>
         </w:rPr>
-        <w:t>O que nós precisamos entender é que o</w:t>
-      </w:r>
-      <w:r>
-        <w:rPr>
-          <w:rFonts w:eastAsia="Times New Roman" w:cs="Times New Roman" w:ascii="Garamond" w:hAnsi="Garamond"/>
-          <w:color w:val="000000"/>
-          <w:kern w:val="0"/>
-          <w:sz w:val="36"/>
-          <w:szCs w:val="36"/>
-          <w:shd w:fill="auto" w:val="clear"/>
-          <w:lang w:val="en-US" w:eastAsia="zh-CN" w:bidi="hi-IN"/>
-        </w:rPr>
-        <w:t xml:space="preserve"> B</w:t>
+        <w:t>O que nós precisamos entender é que o B</w:t>
       </w:r>
       <w:r>
         <w:rPr>
@@ -15490,7 +15257,15 @@
         </w:rPr>
       </w:pPr>
       <w:r>
-        <w:rPr/>
+        <w:rPr>
+          <w:rFonts w:eastAsia="Times New Roman" w:cs="Times New Roman" w:ascii="Garamond" w:hAnsi="Garamond"/>
+          <w:color w:val="000000"/>
+          <w:kern w:val="0"/>
+          <w:sz w:val="36"/>
+          <w:szCs w:val="36"/>
+          <w:shd w:fill="auto" w:val="clear"/>
+          <w:lang w:val="en-US" w:eastAsia="zh-CN" w:bidi="hi-IN"/>
+        </w:rPr>
       </w:r>
       <w:r>
         <w:br w:type="page"/>
@@ -15818,31 +15593,7 @@
           <w:shd w:fill="auto" w:val="clear"/>
           <w:lang w:val="en-US" w:eastAsia="zh-CN" w:bidi="hi-IN"/>
         </w:rPr>
-        <w:t xml:space="preserve"> hoje</w:t>
-      </w:r>
-      <w:r>
-        <w:rPr>
-          <w:rFonts w:eastAsia="Times New Roman" w:cs="Times New Roman" w:ascii="Garamond" w:hAnsi="Garamond"/>
-          <w:color w:val="000000"/>
-          <w:kern w:val="0"/>
-          <w:sz w:val="36"/>
-          <w:szCs w:val="36"/>
-          <w:shd w:fill="auto" w:val="clear"/>
-          <w:lang w:val="en-US" w:eastAsia="zh-CN" w:bidi="hi-IN"/>
-        </w:rPr>
-        <w:t xml:space="preserve">  coloca sob nossos ombros a responsabilidade </w:t>
-      </w:r>
-      <w:r>
-        <w:rPr>
-          <w:rFonts w:eastAsia="Times New Roman" w:cs="Times New Roman" w:ascii="Garamond" w:hAnsi="Garamond"/>
-          <w:color w:val="000000"/>
-          <w:kern w:val="0"/>
-          <w:sz w:val="36"/>
-          <w:szCs w:val="36"/>
-          <w:shd w:fill="auto" w:val="clear"/>
-          <w:lang w:val="en-US" w:eastAsia="zh-CN" w:bidi="hi-IN"/>
-        </w:rPr>
-        <w:t xml:space="preserve">de </w:t>
+        <w:t xml:space="preserve"> hoje  coloca sob nossos ombros a responsabilidade de </w:t>
       </w:r>
       <w:r>
         <w:rPr>
@@ -15967,31 +15718,7 @@
           <w:shd w:fill="auto" w:val="clear"/>
           <w:lang w:val="en-US" w:eastAsia="zh-CN" w:bidi="hi-IN"/>
         </w:rPr>
-        <w:t xml:space="preserve"> pela qual temos que passar. </w:t>
-      </w:r>
-      <w:r>
-        <w:rPr>
-          <w:rFonts w:eastAsia="Times New Roman" w:cs="Times New Roman" w:ascii="Garamond" w:hAnsi="Garamond"/>
-          <w:color w:val="000000"/>
-          <w:kern w:val="0"/>
-          <w:sz w:val="36"/>
-          <w:szCs w:val="36"/>
-          <w:shd w:fill="auto" w:val="clear"/>
-          <w:lang w:val="en-US" w:eastAsia="zh-CN" w:bidi="hi-IN"/>
-        </w:rPr>
-        <w:t>Isso não</w:t>
-      </w:r>
-      <w:r>
-        <w:rPr>
-          <w:rFonts w:eastAsia="Times New Roman" w:cs="Times New Roman" w:ascii="Garamond" w:hAnsi="Garamond"/>
-          <w:color w:val="000000"/>
-          <w:kern w:val="0"/>
-          <w:sz w:val="36"/>
-          <w:szCs w:val="36"/>
-          <w:shd w:fill="auto" w:val="clear"/>
-          <w:lang w:val="en-US" w:eastAsia="zh-CN" w:bidi="hi-IN"/>
-        </w:rPr>
-        <w:t xml:space="preserve"> envolve somente </w:t>
+        <w:t xml:space="preserve"> pela qual temos que passar. Isso não envolve somente </w:t>
       </w:r>
       <w:r>
         <w:rPr>
@@ -16415,7 +16142,15 @@
         </w:rPr>
       </w:pPr>
       <w:r>
-        <w:rPr/>
+        <w:rPr>
+          <w:rFonts w:eastAsia="Times New Roman" w:cs="Times New Roman" w:ascii="Garamond" w:hAnsi="Garamond"/>
+          <w:color w:val="000000"/>
+          <w:kern w:val="0"/>
+          <w:sz w:val="36"/>
+          <w:szCs w:val="36"/>
+          <w:shd w:fill="auto" w:val="clear"/>
+          <w:lang w:val="en-US" w:eastAsia="zh-CN" w:bidi="hi-IN"/>
+        </w:rPr>
       </w:r>
     </w:p>
     <w:p>
@@ -16555,19 +16290,7 @@
           <w:shd w:fill="auto" w:val="clear"/>
           <w:lang w:val="en-US" w:eastAsia="zh-CN" w:bidi="hi-IN"/>
         </w:rPr>
-        <w:t xml:space="preserve">. Até </w:t>
-      </w:r>
-      <w:r>
-        <w:rPr>
-          <w:rFonts w:eastAsia="Times New Roman" w:cs="Times New Roman" w:ascii="Garamond" w:hAnsi="Garamond"/>
-          <w:color w:val="000000"/>
-          <w:kern w:val="0"/>
-          <w:sz w:val="36"/>
-          <w:szCs w:val="36"/>
-          <w:shd w:fill="auto" w:val="clear"/>
-          <w:lang w:val="en-US" w:eastAsia="zh-CN" w:bidi="hi-IN"/>
-        </w:rPr>
-        <w:t xml:space="preserve">que a </w:t>
+        <w:t xml:space="preserve">. Até que a </w:t>
       </w:r>
       <w:r>
         <w:rPr>
@@ -16627,55 +16350,19 @@
           <w:shd w:fill="FFFF00" w:val="clear"/>
           <w:lang w:val="en-US" w:eastAsia="zh-CN" w:bidi="hi-IN"/>
         </w:rPr>
-        <w:t>mora</w:t>
-      </w:r>
-      <w:r>
-        <w:rPr>
-          <w:rFonts w:eastAsia="Times New Roman" w:cs="Times New Roman" w:ascii="Garamond" w:hAnsi="Garamond"/>
-          <w:color w:val="000000"/>
-          <w:kern w:val="0"/>
-          <w:sz w:val="36"/>
-          <w:szCs w:val="36"/>
-          <w:shd w:fill="FFFF00" w:val="clear"/>
-          <w:lang w:val="en-US" w:eastAsia="zh-CN" w:bidi="hi-IN"/>
-        </w:rPr>
-        <w:t>l</w:t>
-      </w:r>
-      <w:r>
-        <w:rPr>
-          <w:rFonts w:eastAsia="Times New Roman" w:cs="Times New Roman" w:ascii="Garamond" w:hAnsi="Garamond"/>
-          <w:color w:val="000000"/>
-          <w:kern w:val="0"/>
-          <w:sz w:val="36"/>
-          <w:szCs w:val="36"/>
-          <w:shd w:fill="FFFF00" w:val="clear"/>
-          <w:lang w:val="en-US" w:eastAsia="zh-CN" w:bidi="hi-IN"/>
-        </w:rPr>
-        <w:t>mente</w:t>
-      </w:r>
-      <w:r>
-        <w:rPr>
-          <w:rFonts w:eastAsia="Times New Roman" w:cs="Times New Roman" w:ascii="Garamond" w:hAnsi="Garamond"/>
-          <w:color w:val="000000"/>
-          <w:kern w:val="0"/>
-          <w:sz w:val="36"/>
-          <w:szCs w:val="36"/>
-          <w:shd w:fill="auto" w:val="clear"/>
-          <w:lang w:val="en-US" w:eastAsia="zh-CN" w:bidi="hi-IN"/>
-        </w:rPr>
-        <w:t>, o</w:t>
-      </w:r>
-      <w:r>
-        <w:rPr>
-          <w:rFonts w:eastAsia="Times New Roman" w:cs="Times New Roman" w:ascii="Garamond" w:hAnsi="Garamond"/>
-          <w:color w:val="000000"/>
-          <w:kern w:val="0"/>
-          <w:sz w:val="36"/>
-          <w:szCs w:val="36"/>
-          <w:shd w:fill="auto" w:val="clear"/>
-          <w:lang w:val="en-US" w:eastAsia="zh-CN" w:bidi="hi-IN"/>
-        </w:rPr>
-        <w:t xml:space="preserve"> mal  estará </w:t>
+        <w:t>moralmente</w:t>
+      </w:r>
+      <w:r>
+        <w:rPr>
+          <w:rFonts w:eastAsia="Times New Roman" w:cs="Times New Roman" w:ascii="Garamond" w:hAnsi="Garamond"/>
+          <w:color w:val="000000"/>
+          <w:kern w:val="0"/>
+          <w:sz w:val="36"/>
+          <w:szCs w:val="36"/>
+          <w:shd w:fill="auto" w:val="clear"/>
+          <w:lang w:val="en-US" w:eastAsia="zh-CN" w:bidi="hi-IN"/>
+        </w:rPr>
+        <w:t xml:space="preserve">, o mal  estará </w:t>
       </w:r>
       <w:r>
         <w:rPr>
@@ -16699,7 +16386,120 @@
           <w:shd w:fill="auto" w:val="clear"/>
           <w:lang w:val="en-US" w:eastAsia="zh-CN" w:bidi="hi-IN"/>
         </w:rPr>
-        <w:t xml:space="preserve"> em nossas vidas</w:t>
+        <w:t xml:space="preserve"> em nossas vidas.</w:t>
+      </w:r>
+    </w:p>
+    <w:p>
+      <w:pPr>
+        <w:pStyle w:val="Normal"/>
+        <w:jc w:val="both"/>
+        <w:rPr>
+          <w:rFonts w:ascii="Garamond" w:hAnsi="Garamond" w:eastAsia="Times New Roman" w:cs="Times New Roman"/>
+          <w:color w:val="000000"/>
+          <w:kern w:val="0"/>
+          <w:sz w:val="36"/>
+          <w:szCs w:val="36"/>
+          <w:shd w:fill="auto" w:val="clear"/>
+          <w:lang w:val="en-US" w:eastAsia="zh-CN" w:bidi="hi-IN"/>
+        </w:rPr>
+      </w:pPr>
+      <w:r>
+        <w:rPr>
+          <w:rFonts w:eastAsia="Times New Roman" w:cs="Times New Roman" w:ascii="Garamond" w:hAnsi="Garamond"/>
+          <w:color w:val="000000"/>
+          <w:kern w:val="0"/>
+          <w:sz w:val="36"/>
+          <w:szCs w:val="36"/>
+          <w:shd w:fill="auto" w:val="clear"/>
+          <w:lang w:val="en-US" w:eastAsia="zh-CN" w:bidi="hi-IN"/>
+        </w:rPr>
+      </w:r>
+    </w:p>
+    <w:p>
+      <w:pPr>
+        <w:pStyle w:val="Normal"/>
+        <w:jc w:val="both"/>
+        <w:rPr>
+          <w:rFonts w:ascii="Garamond" w:hAnsi="Garamond" w:eastAsia="Times New Roman" w:cs="Times New Roman"/>
+          <w:color w:val="000000"/>
+          <w:kern w:val="0"/>
+          <w:sz w:val="36"/>
+          <w:szCs w:val="36"/>
+          <w:shd w:fill="auto" w:val="clear"/>
+          <w:lang w:val="en-US" w:eastAsia="zh-CN" w:bidi="hi-IN"/>
+        </w:rPr>
+      </w:pPr>
+      <w:r>
+        <w:rPr>
+          <w:rFonts w:eastAsia="Times New Roman" w:cs="Times New Roman" w:ascii="Garamond" w:hAnsi="Garamond"/>
+          <w:color w:val="000000"/>
+          <w:kern w:val="0"/>
+          <w:sz w:val="36"/>
+          <w:szCs w:val="36"/>
+          <w:shd w:fill="auto" w:val="clear"/>
+          <w:lang w:val="en-US" w:eastAsia="zh-CN" w:bidi="hi-IN"/>
+        </w:rPr>
+        <w:t xml:space="preserve">Se nos </w:t>
+      </w:r>
+      <w:r>
+        <w:rPr>
+          <w:rFonts w:eastAsia="Times New Roman" w:cs="Times New Roman" w:ascii="Garamond" w:hAnsi="Garamond"/>
+          <w:color w:val="000000"/>
+          <w:kern w:val="0"/>
+          <w:sz w:val="36"/>
+          <w:szCs w:val="36"/>
+          <w:shd w:fill="FFFF00" w:val="clear"/>
+          <w:lang w:val="en-US" w:eastAsia="zh-CN" w:bidi="hi-IN"/>
+        </w:rPr>
+        <w:t>vincularmos</w:t>
+      </w:r>
+      <w:r>
+        <w:rPr>
+          <w:rFonts w:eastAsia="Times New Roman" w:cs="Times New Roman" w:ascii="Garamond" w:hAnsi="Garamond"/>
+          <w:color w:val="000000"/>
+          <w:kern w:val="0"/>
+          <w:sz w:val="36"/>
+          <w:szCs w:val="36"/>
+          <w:shd w:fill="auto" w:val="clear"/>
+          <w:lang w:val="en-US" w:eastAsia="zh-CN" w:bidi="hi-IN"/>
+        </w:rPr>
+        <w:t xml:space="preserve"> a ele, </w:t>
+      </w:r>
+      <w:r>
+        <w:rPr>
+          <w:rFonts w:eastAsia="Times New Roman" w:cs="Times New Roman" w:ascii="Garamond" w:hAnsi="Garamond"/>
+          <w:color w:val="000000"/>
+          <w:kern w:val="0"/>
+          <w:sz w:val="36"/>
+          <w:szCs w:val="36"/>
+          <w:shd w:fill="FFFF00" w:val="clear"/>
+          <w:lang w:val="en-US" w:eastAsia="zh-CN" w:bidi="hi-IN"/>
+        </w:rPr>
+        <w:t>vibrando em suas faixas inferiores</w:t>
+      </w:r>
+      <w:r>
+        <w:rPr>
+          <w:rFonts w:eastAsia="Times New Roman" w:cs="Times New Roman" w:ascii="Garamond" w:hAnsi="Garamond"/>
+          <w:color w:val="000000"/>
+          <w:kern w:val="0"/>
+          <w:sz w:val="36"/>
+          <w:szCs w:val="36"/>
+          <w:shd w:fill="auto" w:val="clear"/>
+          <w:lang w:val="en-US" w:eastAsia="zh-CN" w:bidi="hi-IN"/>
+        </w:rPr>
+        <w:t xml:space="preserve">, talvez não tenhamos as condições necessárias para </w:t>
+      </w:r>
+      <w:r>
+        <w:rPr>
+          <w:rFonts w:eastAsia="Times New Roman" w:cs="Times New Roman" w:ascii="Garamond" w:hAnsi="Garamond"/>
+          <w:color w:val="000000"/>
+          <w:kern w:val="0"/>
+          <w:sz w:val="36"/>
+          <w:szCs w:val="36"/>
+          <w:shd w:fill="FFFF00" w:val="clear"/>
+          <w:lang w:val="en-US" w:eastAsia="zh-CN" w:bidi="hi-IN"/>
+        </w:rPr>
+        <w:t>merecer um lugar na Terra em regeneração</w:t>
       </w:r>
       <w:r>
         <w:rPr>
@@ -16719,166 +16519,18 @@
         <w:pStyle w:val="Normal"/>
         <w:jc w:val="both"/>
         <w:rPr>
-          <w:rFonts w:ascii="Garamond" w:hAnsi="Garamond" w:eastAsia="Times New Roman" w:cs="Times New Roman"/>
-          <w:color w:val="000000"/>
-          <w:kern w:val="0"/>
-          <w:sz w:val="36"/>
-          <w:szCs w:val="36"/>
-          <w:shd w:fill="auto" w:val="clear"/>
-          <w:lang w:val="en-US" w:eastAsia="zh-CN" w:bidi="hi-IN"/>
-        </w:rPr>
-      </w:pPr>
-      <w:r>
-        <w:rPr/>
-      </w:r>
-    </w:p>
-    <w:p>
-      <w:pPr>
-        <w:pStyle w:val="Normal"/>
-        <w:jc w:val="both"/>
-        <w:rPr>
-          <w:rFonts w:ascii="Garamond" w:hAnsi="Garamond" w:eastAsia="Times New Roman" w:cs="Times New Roman"/>
-          <w:color w:val="000000"/>
-          <w:kern w:val="0"/>
-          <w:sz w:val="36"/>
-          <w:szCs w:val="36"/>
-          <w:shd w:fill="auto" w:val="clear"/>
-          <w:lang w:val="en-US" w:eastAsia="zh-CN" w:bidi="hi-IN"/>
-        </w:rPr>
-      </w:pPr>
-      <w:r>
-        <w:rPr>
-          <w:rFonts w:eastAsia="Times New Roman" w:cs="Times New Roman" w:ascii="Garamond" w:hAnsi="Garamond"/>
-          <w:color w:val="000000"/>
-          <w:kern w:val="0"/>
-          <w:sz w:val="36"/>
-          <w:szCs w:val="36"/>
-          <w:shd w:fill="auto" w:val="clear"/>
-          <w:lang w:val="en-US" w:eastAsia="zh-CN" w:bidi="hi-IN"/>
-        </w:rPr>
-        <w:t xml:space="preserve">Se nos </w:t>
-      </w:r>
-      <w:r>
-        <w:rPr>
-          <w:rFonts w:eastAsia="Times New Roman" w:cs="Times New Roman" w:ascii="Garamond" w:hAnsi="Garamond"/>
-          <w:color w:val="000000"/>
-          <w:kern w:val="0"/>
-          <w:sz w:val="36"/>
-          <w:szCs w:val="36"/>
-          <w:shd w:fill="FFFF00" w:val="clear"/>
-          <w:lang w:val="en-US" w:eastAsia="zh-CN" w:bidi="hi-IN"/>
-        </w:rPr>
-        <w:t>vincularmos</w:t>
-      </w:r>
-      <w:r>
-        <w:rPr>
-          <w:rFonts w:eastAsia="Times New Roman" w:cs="Times New Roman" w:ascii="Garamond" w:hAnsi="Garamond"/>
-          <w:color w:val="000000"/>
-          <w:kern w:val="0"/>
-          <w:sz w:val="36"/>
-          <w:szCs w:val="36"/>
-          <w:shd w:fill="auto" w:val="clear"/>
-          <w:lang w:val="en-US" w:eastAsia="zh-CN" w:bidi="hi-IN"/>
-        </w:rPr>
-        <w:t xml:space="preserve"> a ele, </w:t>
-      </w:r>
-      <w:r>
-        <w:rPr>
-          <w:rFonts w:eastAsia="Times New Roman" w:cs="Times New Roman" w:ascii="Garamond" w:hAnsi="Garamond"/>
-          <w:color w:val="000000"/>
-          <w:kern w:val="0"/>
-          <w:sz w:val="36"/>
-          <w:szCs w:val="36"/>
-          <w:shd w:fill="FFFF00" w:val="clear"/>
-          <w:lang w:val="en-US" w:eastAsia="zh-CN" w:bidi="hi-IN"/>
-        </w:rPr>
-        <w:t>vibrando em suas faixas inferiores</w:t>
-      </w:r>
-      <w:r>
-        <w:rPr>
-          <w:rFonts w:eastAsia="Times New Roman" w:cs="Times New Roman" w:ascii="Garamond" w:hAnsi="Garamond"/>
-          <w:color w:val="000000"/>
-          <w:kern w:val="0"/>
-          <w:sz w:val="36"/>
-          <w:szCs w:val="36"/>
-          <w:shd w:fill="auto" w:val="clear"/>
-          <w:lang w:val="en-US" w:eastAsia="zh-CN" w:bidi="hi-IN"/>
-        </w:rPr>
-        <w:t xml:space="preserve">, talvez não tenhamos as condições necessárias para </w:t>
-      </w:r>
-      <w:r>
-        <w:rPr>
-          <w:rFonts w:eastAsia="Times New Roman" w:cs="Times New Roman" w:ascii="Garamond" w:hAnsi="Garamond"/>
-          <w:color w:val="000000"/>
-          <w:kern w:val="0"/>
-          <w:sz w:val="36"/>
-          <w:szCs w:val="36"/>
-          <w:shd w:fill="FFFF00" w:val="clear"/>
-          <w:lang w:val="en-US" w:eastAsia="zh-CN" w:bidi="hi-IN"/>
-        </w:rPr>
-        <w:t>merecer um lugar na Terra em regeneração</w:t>
-      </w:r>
-      <w:r>
-        <w:rPr>
-          <w:rFonts w:eastAsia="Times New Roman" w:cs="Times New Roman" w:ascii="Garamond" w:hAnsi="Garamond"/>
-          <w:color w:val="000000"/>
-          <w:kern w:val="0"/>
-          <w:sz w:val="36"/>
-          <w:szCs w:val="36"/>
-          <w:shd w:fill="auto" w:val="clear"/>
-          <w:lang w:val="en-US" w:eastAsia="zh-CN" w:bidi="hi-IN"/>
-        </w:rPr>
-        <w:t>.</w:t>
-      </w:r>
-    </w:p>
-    <w:p>
-      <w:pPr>
-        <w:pStyle w:val="Normal"/>
-        <w:jc w:val="both"/>
-        <w:rPr>
-          <w:rFonts w:ascii="Garamond" w:hAnsi="Garamond" w:eastAsia="Times New Roman" w:cs="Times New Roman"/>
-          <w:color w:val="000000"/>
-          <w:kern w:val="0"/>
-          <w:sz w:val="36"/>
-          <w:szCs w:val="36"/>
-          <w:shd w:fill="auto" w:val="clear"/>
-          <w:lang w:val="en-US" w:eastAsia="zh-CN" w:bidi="hi-IN"/>
-        </w:rPr>
-      </w:pPr>
-      <w:r>
-        <w:rPr>
-          <w:rFonts w:eastAsia="Times New Roman" w:cs="Times New Roman" w:ascii="Garamond" w:hAnsi="Garamond"/>
-          <w:color w:val="000000"/>
-          <w:kern w:val="0"/>
-          <w:sz w:val="36"/>
-          <w:szCs w:val="36"/>
-          <w:shd w:fill="auto" w:val="clear"/>
-          <w:lang w:val="en-US" w:eastAsia="zh-CN" w:bidi="hi-IN"/>
-        </w:rPr>
-      </w:r>
-    </w:p>
-    <w:p>
-      <w:pPr>
-        <w:pStyle w:val="Normal"/>
-        <w:jc w:val="both"/>
-        <w:rPr>
-          <w:rFonts w:ascii="Garamond" w:hAnsi="Garamond" w:eastAsia="Times New Roman" w:cs="Times New Roman"/>
-          <w:color w:val="000000"/>
-          <w:kern w:val="0"/>
-          <w:sz w:val="36"/>
-          <w:szCs w:val="36"/>
-          <w:shd w:fill="auto" w:val="clear"/>
-          <w:lang w:val="en-US" w:eastAsia="zh-CN" w:bidi="hi-IN"/>
-        </w:rPr>
-      </w:pPr>
-      <w:r>
-        <w:rPr>
-          <w:rFonts w:eastAsia="Times New Roman" w:cs="Times New Roman" w:ascii="Garamond" w:hAnsi="Garamond"/>
-          <w:color w:val="000000"/>
-          <w:kern w:val="0"/>
-          <w:sz w:val="36"/>
-          <w:szCs w:val="36"/>
-          <w:shd w:fill="auto" w:val="clear"/>
+          <w:highlight w:val="none"/>
+          <w:shd w:fill="FFFF00" w:val="clear"/>
+        </w:rPr>
+      </w:pPr>
+      <w:r>
+        <w:rPr>
+          <w:rFonts w:eastAsia="Times New Roman" w:cs="Times New Roman" w:ascii="Garamond" w:hAnsi="Garamond"/>
+          <w:color w:val="000000"/>
+          <w:kern w:val="0"/>
+          <w:sz w:val="36"/>
+          <w:szCs w:val="36"/>
+          <w:shd w:fill="FFFF00" w:val="clear"/>
           <w:lang w:val="en-US" w:eastAsia="zh-CN" w:bidi="hi-IN"/>
         </w:rPr>
         <w:t>Façamos o esforço sincero de viver o Evangelho, expressando todas as formas de amor que nos unem a Deus, ao próximo e a nós mesmos.</w:t>
@@ -16971,7 +16623,7 @@
         <w:bCs/>
         <w:rFonts w:ascii="Garamond" w:hAnsi="Garamond"/>
       </w:rPr>
-      <w:t>38</w:t>
+      <w:t>39</w:t>
     </w:r>
     <w:r>
       <w:rPr>

</xml_diff>